<commit_message>
Remove status note from handout; relabel sample request
</commit_message>
<xml_diff>
--- a/docs/conference-2026/MIWAE_Framework_and_Coursebook_Fit_Rubric_Handout_2026-09-20.docx
+++ b/docs/conference-2026/MIWAE_Framework_and_Coursebook_Fit_Rubric_Handout_2026-09-20.docx
@@ -154,21 +154,6 @@
       </w:r>
       <w:r>
         <w:t xml:space="preserve"> MIWAE supports transparent comparison of EMI textbooks for multilingual readers. It connects reader needs with observable textual choices and checks whether those choices appear where they are needed.</w:t>
-      </w:r>
-    </w:p>
-    <w:p>
-      <w:pPr>
-        <w:spacing w:after="80" w:line="259" w:lineRule="auto"/>
-      </w:pPr>
-      <w:r>
-        <w:rPr>
-          <w:b/>
-          <w:color w:val="B94D35"/>
-        </w:rPr>
-        <w:t>Status:</w:t>
-      </w:r>
-      <w:r>
-        <w:t xml:space="preserve"> This is a provisional coursebook fit review instrument rather than a validated universal scale. Apply it to matched samples and document every judgement.</w:t>
       </w:r>
     </w:p>
     <w:p>

</xml_diff>